<commit_message>
Fix paired figures: split into single-image blocks (10 figures)
- Root cause: two <img> in one <p> caused the md->docx converter to drop
  the 2nd image (octmnist_loss_curves, quickdraw_progression), leaving
  Figures 3 and 7 with 'Left/Right' captions but only one panel
- Split each pair into its own single-image figure block (converter-safe),
  renumber to Figures 1-10, and split captions/interpretation accordingly
- Regenerate placeholder DOCX from corrected Markdown
</commit_message>
<xml_diff>
--- a/GAN_Assignment_Report.docx
+++ b/GAN_Assignment_Report.docx
@@ -348,7 +348,7 @@
           <w:i/>
           <w:color w:val="777777"/>
         </w:rPr>
-        <w:t xml:space="preserve">[ insert figure image: octmnist_real_vs_fake.png  |  octmnist_loss_curves.png ]</w:t>
+        <w:t xml:space="preserve">[ insert figure image: octmnist_real_vs_fake.png ]</w:t>
       </w:r>
     </w:p>
     <w:p>
@@ -363,10 +363,10 @@
         <w:rPr>
           <w:i/>
         </w:rPr>
-        <w:t xml:space="preserve"> Left: real vs generated OCT scans. Right: DCGAN loss curves.</w:t>
-      </w:r>
-      <w:r>
-        <w:t xml:space="preserve"> The fakes capture the retinal band and vary across the batch (no mode collapse). The loss curves show the discriminator staying low (≈0.4-0.6) while the generator oscillates in the 2-5 range without collapsing, a discriminator that keeps a modest edge but never wins outright, so the generator kept receiving gradient. The measured FID (Heusel et al., 2017) is </w:t>
+        <w:t xml:space="preserve"> Real (left) vs generated (right) OCT scans.</w:t>
+      </w:r>
+      <w:r>
+        <w:t xml:space="preserve"> The fakes capture the retinal band and vary across the batch (no mode collapse). The measured FID (Heusel et al., 2017) is </w:t>
       </w:r>
       <w:r>
         <w:rPr>
@@ -376,37 +376,6 @@
       </w:r>
       <w:r>
         <w:t xml:space="preserve"> (lower is better), high, and matching the visible blur in which fine sub-layers and speckle are lost. Three factors inflate it beyond raw quality: only 60 epochs on a subset, upscaling 28→32 px, and FID's use of an ImageNet-trained InceptionV3 (Szegedy et al., 2016) that never saw single-channel medical images.</w:t>
-      </w:r>
-    </w:p>
-    <w:p>
-      <w:r>
-        <w:rPr>
-          <w:b/>
-        </w:rPr>
-        <w:t xml:space="preserve">Reflection ("looks real vs is true").</w:t>
-      </w:r>
-      <w:r>
-        <w:t xml:space="preserve"> The discriminator only ever answers "real or fake"; nothing checks that a generated structure is physiologically valid. The generator can therefore invent a bright band or lesion-like patch that never occurred in a real patient, as long as it looks plausible, this is the hazard of treating GAN output as data. A hallucinated region could mimic disease that is absent, or smooth over a real anomaly, so a synthetic scan must never be used diagnostically. The defensible uses are augmentation and teaching, and any model trained on synthetic scans should be validated on a real-only holdout to confirm it has not just learned to spot GAN artefacts.</w:t>
-      </w:r>
-    </w:p>
-    <w:p>
-      <w:r>
-        <w:rPr>
-          <w:b/>
-        </w:rPr>
-        <w:t xml:space="preserve">Extension: conditional GAN.</w:t>
-      </w:r>
-      <w:r>
-        <w:t xml:space="preserve"> The unconditional model cannot be asked for a specific class. A conditional GAN (Mirza and Osindero, 2014) feeds the label into both networks (embedded and concatenated with the latent vector for the generator; embedded as an extra image channel for the discriminator), forcing realism </w:t>
-      </w:r>
-      <w:r>
-        <w:rPr>
-          <w:i/>
-        </w:rPr>
-        <w:t xml:space="preserve">per class</w:t>
-      </w:r>
-      <w:r>
-        <w:t xml:space="preserve">. Each class is oversampled to balance the data, and the discriminator uses a slower learning rate, a two-time-scale update that stabilises training (Heusel et al., 2017).</w:t>
       </w:r>
     </w:p>
     <w:p>
@@ -424,7 +393,7 @@
           <w:i/>
           <w:color w:val="777777"/>
         </w:rPr>
-        <w:t xml:space="preserve">[ insert figure image: octmnist_cgan_per_class.png ]</w:t>
+        <w:t xml:space="preserve">[ insert figure image: octmnist_loss_curves.png ]</w:t>
       </w:r>
     </w:p>
     <w:p>
@@ -439,85 +408,41 @@
         <w:rPr>
           <w:i/>
         </w:rPr>
-        <w:t xml:space="preserve"> Conditional GAN output, one diagnostic class per row.</w:t>
-      </w:r>
-      <w:r>
-        <w:t xml:space="preserve"> Each row is visibly class-consistent, so the model produces a chosen category on demand. Its losses end near D = 0.34, G = 4.90, similar in character to the unconditional run.</w:t>
-      </w:r>
-    </w:p>
-    <w:p>
-      <w:pPr>
-        <w:pStyle w:val="Heading1"/>
-      </w:pPr>
-      <w:r>
-        <w:t xml:space="preserve">4. Part 2.2: Cybersecurity - CICIDS2017 Synthetic Traffic (Tabular GAN, PyTorch)</w:t>
-      </w:r>
-    </w:p>
-    <w:p>
-      <w:r>
-        <w:rPr>
-          <w:b/>
-        </w:rPr>
-        <w:t xml:space="preserve">Dataset.</w:t>
-      </w:r>
-      <w:r>
-        <w:t xml:space="preserve"> CICIDS2017 (Sharafaldin et al., 2018) spans eight day-files that must be combined. Across all days the data are heavily imbalanced: 2,273,097 BENIGN flows dwarf the largest attacks, DoS Hulk (231,073), PortScan (158,930), DDoS (128,027), down to rarities like Infiltration (36), SQL Injection (21) and Heartbleed (11). The main model focuses on the </w:t>
-      </w:r>
-      <w:r>
-        <w:rPr>
-          <w:b/>
-        </w:rPr>
-        <w:t xml:space="preserve">Wednesday file</w:t>
-      </w:r>
-      <w:r>
-        <w:t xml:space="preserve">: 692,703 rows, reduced to 691,406 after dropping ±inf/NaN values (e.g. </w:t>
-      </w:r>
-      <w:r>
-        <w:rPr>
-          <w:i/>
-        </w:rPr>
-        <w:t xml:space="preserve">Flow Bytes/s</w:t>
-      </w:r>
-      <w:r>
-        <w:t xml:space="preserve"> with zero duration), over 78 numeric features. Wednesday holds 439,683 BENIGN and 251,723 attack flows; I take a balanced 20,000-per-class subsample (40,000 rows) and z-score the features.</w:t>
-      </w:r>
-    </w:p>
-    <w:p>
-      <w:r>
-        <w:rPr>
-          <w:b/>
-        </w:rPr>
-        <w:t xml:space="preserve">Model and justification.</w:t>
-      </w:r>
-      <w:r>
-        <w:t xml:space="preserve"> With no spatial grid, a DCGAN makes no sense; the right model is an MLP GAN emitting a full 78-D vector at once. The generator is three BatchNorm + LeakyReLU blocks (256 units) with a </w:t>
-      </w:r>
-      <w:r>
-        <w:rPr>
-          <w:i/>
-        </w:rPr>
-        <w:t xml:space="preserve">linear</w:t>
-      </w:r>
-      <w:r>
-        <w:t xml:space="preserve"> output, deliberately not </w:t>
-      </w:r>
-      <w:r>
-        <w:rPr>
-          <w:rFonts w:ascii="Consolas" w:hAnsi="Consolas"/>
-        </w:rPr>
-        <w:t xml:space="preserve">tanh</w:t>
-      </w:r>
-      <w:r>
-        <w:t xml:space="preserve">, because the features are z-scored rather than bounded to [-1, 1], so a linear head fits them better. The discriminator is a 256-unit LeakyReLU MLP with 0.3 dropout. Training matches the image parts (Adam lr = 2e-4, </w:t>
-      </w:r>
-      <w:r>
-        <w:rPr>
-          <w:rFonts w:ascii="Consolas" w:hAnsi="Consolas"/>
-        </w:rPr>
-        <w:t xml:space="preserve">BCEWithLogitsLoss</w:t>
-      </w:r>
-      <w:r>
-        <w:t xml:space="preserve">, label smoothing). Over 60 epochs the discriminator loss falls smoothly from 1.3548 to 1.0248 and the generator rises from 0.8257 to 1.3455, a slow, stable separation with no collapse.</w:t>
+        <w:t xml:space="preserve"> OCTMNIST DCGAN training loss curves.</w:t>
+      </w:r>
+      <w:r>
+        <w:t xml:space="preserve"> The discriminator loss stays low (≈0.4-0.6) while the generator oscillates in the 2-5 range without collapsing, a discriminator that keeps a modest edge but never wins outright, so the generator kept receiving usable gradient across all 60 epochs.</w:t>
+      </w:r>
+    </w:p>
+    <w:p>
+      <w:r>
+        <w:rPr>
+          <w:b/>
+        </w:rPr>
+        <w:t xml:space="preserve">Reflection ("looks real vs is true").</w:t>
+      </w:r>
+      <w:r>
+        <w:t xml:space="preserve"> The discriminator only ever answers "real or fake"; nothing checks that a generated structure is physiologically valid. The generator can therefore invent a bright band or lesion-like patch that never occurred in a real patient, as long as it looks plausible, this is the hazard of treating GAN output as data. A hallucinated region could mimic disease that is absent, or smooth over a real anomaly, so a synthetic scan must never be used diagnostically. The defensible uses are augmentation and teaching, and any model trained on synthetic scans should be validated on a real-only holdout to confirm it has not just learned to spot GAN artefacts.</w:t>
+      </w:r>
+    </w:p>
+    <w:p>
+      <w:r>
+        <w:rPr>
+          <w:b/>
+        </w:rPr>
+        <w:t xml:space="preserve">Extension: conditional GAN.</w:t>
+      </w:r>
+      <w:r>
+        <w:t xml:space="preserve"> The unconditional model cannot be asked for a specific class. A conditional GAN (Mirza and Osindero, 2014) feeds the label into both networks (embedded and concatenated with the latent vector for the generator; embedded as an extra image channel for the discriminator), forcing realism </w:t>
+      </w:r>
+      <w:r>
+        <w:rPr>
+          <w:i/>
+        </w:rPr>
+        <w:t xml:space="preserve">per class</w:t>
+      </w:r>
+      <w:r>
+        <w:t xml:space="preserve">. Each class is oversampled to balance the data, and the discriminator uses a slower learning rate, a two-time-scale update that stabilises training (Heusel et al., 2017).</w:t>
       </w:r>
     </w:p>
     <w:p>
@@ -535,7 +460,7 @@
           <w:i/>
           <w:color w:val="777777"/>
         </w:rPr>
-        <w:t xml:space="preserve">[ insert figure image: pca_real_vs_fake.png ]</w:t>
+        <w:t xml:space="preserve">[ insert figure image: octmnist_cgan_per_class.png ]</w:t>
       </w:r>
     </w:p>
     <w:p>
@@ -550,138 +475,85 @@
         <w:rPr>
           <w:i/>
         </w:rPr>
-        <w:t xml:space="preserve"> PCA of real (blue) vs generated (red) flow vectors.</w:t>
-      </w:r>
-      <w:r>
-        <w:t xml:space="preserve"> In PCA (Jolliffe, 2002), and equally in t-SNE (van der Maaten and Hinton, 2008), the generated cloud sits on the main body of real points but is more concentrated, capturing where most traffic lives without reaching the tails. Quantitatively, the mean absolute error on feature </w:t>
-      </w:r>
-      <w:r>
-        <w:rPr>
-          <w:i/>
-        </w:rPr>
-        <w:t xml:space="preserve">means</w:t>
-      </w:r>
-      <w:r>
-        <w:t xml:space="preserve"> is a good </w:t>
-      </w:r>
-      <w:r>
-        <w:rPr>
-          <w:b/>
-        </w:rPr>
-        <w:t xml:space="preserve">0.0723</w:t>
-      </w:r>
-      <w:r>
-        <w:t xml:space="preserve"> (standardised units) but on </w:t>
-      </w:r>
-      <w:r>
-        <w:rPr>
-          <w:i/>
-        </w:rPr>
-        <w:t xml:space="preserve">standard deviations</w:t>
-      </w:r>
-      <w:r>
-        <w:t xml:space="preserve"> a weaker </w:t>
-      </w:r>
-      <w:r>
-        <w:rPr>
-          <w:b/>
-        </w:rPr>
-        <w:t xml:space="preserve">0.3179</w:t>
-      </w:r>
-      <w:r>
-        <w:t xml:space="preserve">: the GAN matches average values far better than spread. The worst-aligned features are timing and flag columns, </w:t>
-      </w:r>
-      <w:r>
-        <w:rPr>
-          <w:rFonts w:ascii="Consolas" w:hAnsi="Consolas"/>
-        </w:rPr>
-        <w:t xml:space="preserve">FIN Flag Count</w:t>
-      </w:r>
-      <w:r>
-        <w:t xml:space="preserve"> (mean error 0.326), the </w:t>
-      </w:r>
-      <w:r>
-        <w:rPr>
-          <w:rFonts w:ascii="Consolas" w:hAnsi="Consolas"/>
-        </w:rPr>
-        <w:t xml:space="preserve">Bwd IAT</w:t>
-      </w:r>
-      <w:r>
-        <w:t xml:space="preserve"> family, </w:t>
-      </w:r>
-      <w:r>
-        <w:rPr>
-          <w:rFonts w:ascii="Consolas" w:hAnsi="Consolas"/>
-        </w:rPr>
-        <w:t xml:space="preserve">Destination Port</w:t>
-      </w:r>
-      <w:r>
-        <w:t xml:space="preserve">, </w:t>
-      </w:r>
-      <w:r>
-        <w:rPr>
-          <w:rFonts w:ascii="Consolas" w:hAnsi="Consolas"/>
-        </w:rPr>
-        <w:t xml:space="preserve">Fwd IAT Mean</w:t>
-      </w:r>
-      <w:r>
-        <w:t xml:space="preserve">, </w:t>
-      </w:r>
-      <w:r>
-        <w:rPr>
-          <w:rFonts w:ascii="Consolas" w:hAnsi="Consolas"/>
-        </w:rPr>
-        <w:t xml:space="preserve">URG Flag Count</w:t>
-      </w:r>
-      <w:r>
-        <w:t xml:space="preserve"> and </w:t>
-      </w:r>
-      <w:r>
-        <w:rPr>
-          <w:rFonts w:ascii="Consolas" w:hAnsi="Consolas"/>
-        </w:rPr>
-        <w:t xml:space="preserve">Fwd PSH Flags</w:t>
-      </w:r>
-      <w:r>
-        <w:t xml:space="preserve">. For the near-binary flags the generated std almost vanishes (</w:t>
-      </w:r>
-      <w:r>
-        <w:rPr>
-          <w:rFonts w:ascii="Consolas" w:hAnsi="Consolas"/>
-        </w:rPr>
-        <w:t xml:space="preserve">URG Flag Count</w:t>
-      </w:r>
-      <w:r>
-        <w:t xml:space="preserve"> 0.030, </w:t>
-      </w:r>
-      <w:r>
-        <w:rPr>
-          <w:rFonts w:ascii="Consolas" w:hAnsi="Consolas"/>
-        </w:rPr>
-        <w:t xml:space="preserve">Fwd PSH Flags</w:t>
-      </w:r>
-      <w:r>
-        <w:t xml:space="preserve"> 0.024, versus real ≈0.9-1.0), so the generator pins them to a constant, partial mode collapse on the discrete features.</w:t>
-      </w:r>
-    </w:p>
-    <w:p>
-      <w:r>
-        <w:rPr>
-          <w:b/>
-        </w:rPr>
-        <w:t xml:space="preserve">Reflection (security).</w:t>
-      </w:r>
-      <w:r>
-        <w:t xml:space="preserve"> The hallucination problem bites harder here: a generated flow only has to look like traffic, a far weaker bar than matching a real attack's timing, packet structure and flag sequences. Used to augment an IDS, a fabricated "attack" matching no real signature could teach the model to miss genuine attacks, while a fabricated "benign" flow drifting attack-ward could raise false positives. Unlike the OCT case there is no visual sanity check for 78 numbers, so the burden falls on quantitative checks that, as the flag collapse shows, can look fine while hiding a behavioural failure. One clarification: the Wednesday file contains </w:t>
-      </w:r>
-      <w:r>
-        <w:rPr>
-          <w:b/>
-        </w:rPr>
-        <w:t xml:space="preserve">DoS</w:t>
-      </w:r>
-      <w:r>
-        <w:t xml:space="preserve"> variants, not DDoS, despite the brief's wording; genuine DDoS is in the Friday file, used below.</w:t>
+        <w:t xml:space="preserve"> Conditional GAN output, one diagnostic class per row.</w:t>
+      </w:r>
+      <w:r>
+        <w:t xml:space="preserve"> Each row is visibly class-consistent, so the model produces a chosen category on demand. Its losses end near D = 0.34, G = 4.90, similar in character to the unconditional run.</w:t>
+      </w:r>
+    </w:p>
+    <w:p>
+      <w:pPr>
+        <w:pStyle w:val="Heading1"/>
+      </w:pPr>
+      <w:r>
+        <w:t xml:space="preserve">4. Part 2.2: Cybersecurity - CICIDS2017 Synthetic Traffic (Tabular GAN, PyTorch)</w:t>
+      </w:r>
+    </w:p>
+    <w:p>
+      <w:r>
+        <w:rPr>
+          <w:b/>
+        </w:rPr>
+        <w:t xml:space="preserve">Dataset.</w:t>
+      </w:r>
+      <w:r>
+        <w:t xml:space="preserve"> CICIDS2017 (Sharafaldin et al., 2018) spans eight day-files that must be combined. Across all days the data are heavily imbalanced: 2,273,097 BENIGN flows dwarf the largest attacks, DoS Hulk (231,073), PortScan (158,930), DDoS (128,027), down to rarities like Infiltration (36), SQL Injection (21) and Heartbleed (11). The main model focuses on the </w:t>
+      </w:r>
+      <w:r>
+        <w:rPr>
+          <w:b/>
+        </w:rPr>
+        <w:t xml:space="preserve">Wednesday file</w:t>
+      </w:r>
+      <w:r>
+        <w:t xml:space="preserve">: 692,703 rows, reduced to 691,406 after dropping ±inf/NaN values (e.g. </w:t>
+      </w:r>
+      <w:r>
+        <w:rPr>
+          <w:i/>
+        </w:rPr>
+        <w:t xml:space="preserve">Flow Bytes/s</w:t>
+      </w:r>
+      <w:r>
+        <w:t xml:space="preserve"> with zero duration), over 78 numeric features. Wednesday holds 439,683 BENIGN and 251,723 attack flows; I take a balanced 20,000-per-class subsample (40,000 rows) and z-score the features.</w:t>
+      </w:r>
+    </w:p>
+    <w:p>
+      <w:r>
+        <w:rPr>
+          <w:b/>
+        </w:rPr>
+        <w:t xml:space="preserve">Model and justification.</w:t>
+      </w:r>
+      <w:r>
+        <w:t xml:space="preserve"> With no spatial grid, a DCGAN makes no sense; the right model is an MLP GAN emitting a full 78-D vector at once. The generator is three BatchNorm + LeakyReLU blocks (256 units) with a </w:t>
+      </w:r>
+      <w:r>
+        <w:rPr>
+          <w:i/>
+        </w:rPr>
+        <w:t xml:space="preserve">linear</w:t>
+      </w:r>
+      <w:r>
+        <w:t xml:space="preserve"> output, deliberately not </w:t>
+      </w:r>
+      <w:r>
+        <w:rPr>
+          <w:rFonts w:ascii="Consolas" w:hAnsi="Consolas"/>
+        </w:rPr>
+        <w:t xml:space="preserve">tanh</w:t>
+      </w:r>
+      <w:r>
+        <w:t xml:space="preserve">, because the features are z-scored rather than bounded to [-1, 1], so a linear head fits them better. The discriminator is a 256-unit LeakyReLU MLP with 0.3 dropout. Training matches the image parts (Adam lr = 2e-4, </w:t>
+      </w:r>
+      <w:r>
+        <w:rPr>
+          <w:rFonts w:ascii="Consolas" w:hAnsi="Consolas"/>
+        </w:rPr>
+        <w:t xml:space="preserve">BCEWithLogitsLoss</w:t>
+      </w:r>
+      <w:r>
+        <w:t xml:space="preserve">, label smoothing). Over 60 epochs the discriminator loss falls smoothly from 1.3548 to 1.0248 and the generator rises from 0.8257 to 1.3455, a slow, stable separation with no collapse.</w:t>
       </w:r>
     </w:p>
     <w:p>
@@ -699,7 +571,7 @@
           <w:i/>
           <w:color w:val="777777"/>
         </w:rPr>
-        <w:t xml:space="preserve">[ insert figure image: pca_full_dataset_by_attack_type.png ]</w:t>
+        <w:t xml:space="preserve">[ insert figure image: pca_real_vs_fake.png ]</w:t>
       </w:r>
     </w:p>
     <w:p>
@@ -714,43 +586,70 @@
         <w:rPr>
           <w:i/>
         </w:rPr>
-        <w:t xml:space="preserve"> All-days PCA coloured by attack type (left) and real-vs-generated (right).</w:t>
-      </w:r>
-      <w:r>
-        <w:t xml:space="preserve"> Combining all eight days (with per-file capping) gives 125,310 rows over every attack family. The generator covers the dense centre (BENIGN, DoS Hulk, true DDoS) but under-represents the smaller clusters. Tellingly, adding diversity made alignment </w:t>
-      </w:r>
-      <w:r>
-        <w:rPr>
-          <w:b/>
-        </w:rPr>
-        <w:t xml:space="preserve">worse</w:t>
-      </w:r>
-      <w:r>
-        <w:t xml:space="preserve">: mean |mean error| rose 0.0723 → </w:t>
-      </w:r>
-      <w:r>
-        <w:rPr>
-          <w:b/>
-        </w:rPr>
-        <w:t xml:space="preserve">0.1300</w:t>
-      </w:r>
-      <w:r>
-        <w:t xml:space="preserve"> and mean |std error| 0.3179 → </w:t>
-      </w:r>
-      <w:r>
-        <w:rPr>
-          <w:b/>
-        </w:rPr>
-        <w:t xml:space="preserve">0.4670</w:t>
-      </w:r>
-      <w:r>
-        <w:t xml:space="preserve">, now dominated by the timing family (</w:t>
-      </w:r>
-      <w:r>
-        <w:rPr>
-          <w:rFonts w:ascii="Consolas" w:hAnsi="Consolas"/>
-        </w:rPr>
-        <w:t xml:space="preserve">Flow Duration</w:t>
+        <w:t xml:space="preserve"> PCA of real (blue) vs generated (red) flow vectors.</w:t>
+      </w:r>
+      <w:r>
+        <w:t xml:space="preserve"> In PCA (Jolliffe, 2002), and equally in t-SNE (van der Maaten and Hinton, 2008), the generated cloud sits on the main body of real points but is more concentrated, capturing where most traffic lives without reaching the tails. Quantitatively, the mean absolute error on feature </w:t>
+      </w:r>
+      <w:r>
+        <w:rPr>
+          <w:i/>
+        </w:rPr>
+        <w:t xml:space="preserve">means</w:t>
+      </w:r>
+      <w:r>
+        <w:t xml:space="preserve"> is a good </w:t>
+      </w:r>
+      <w:r>
+        <w:rPr>
+          <w:b/>
+        </w:rPr>
+        <w:t xml:space="preserve">0.0723</w:t>
+      </w:r>
+      <w:r>
+        <w:t xml:space="preserve"> (standardised units) but on </w:t>
+      </w:r>
+      <w:r>
+        <w:rPr>
+          <w:i/>
+        </w:rPr>
+        <w:t xml:space="preserve">standard deviations</w:t>
+      </w:r>
+      <w:r>
+        <w:t xml:space="preserve"> a weaker </w:t>
+      </w:r>
+      <w:r>
+        <w:rPr>
+          <w:b/>
+        </w:rPr>
+        <w:t xml:space="preserve">0.3179</w:t>
+      </w:r>
+      <w:r>
+        <w:t xml:space="preserve">: the GAN matches average values far better than spread. The worst-aligned features are timing and flag columns, </w:t>
+      </w:r>
+      <w:r>
+        <w:rPr>
+          <w:rFonts w:ascii="Consolas" w:hAnsi="Consolas"/>
+        </w:rPr>
+        <w:t xml:space="preserve">FIN Flag Count</w:t>
+      </w:r>
+      <w:r>
+        <w:t xml:space="preserve"> (mean error 0.326), the </w:t>
+      </w:r>
+      <w:r>
+        <w:rPr>
+          <w:rFonts w:ascii="Consolas" w:hAnsi="Consolas"/>
+        </w:rPr>
+        <w:t xml:space="preserve">Bwd IAT</w:t>
+      </w:r>
+      <w:r>
+        <w:t xml:space="preserve"> family, </w:t>
+      </w:r>
+      <w:r>
+        <w:rPr>
+          <w:rFonts w:ascii="Consolas" w:hAnsi="Consolas"/>
+        </w:rPr>
+        <w:t xml:space="preserve">Destination Port</w:t>
       </w:r>
       <w:r>
         <w:t xml:space="preserve">, </w:t>
@@ -759,7 +658,7 @@
         <w:rPr>
           <w:rFonts w:ascii="Consolas" w:hAnsi="Consolas"/>
         </w:rPr>
-        <w:t xml:space="preserve">Fwd IAT Total</w:t>
+        <w:t xml:space="preserve">Fwd IAT Mean</w:t>
       </w:r>
       <w:r>
         <w:t xml:space="preserve">, </w:t>
@@ -768,49 +667,57 @@
         <w:rPr>
           <w:rFonts w:ascii="Consolas" w:hAnsi="Consolas"/>
         </w:rPr>
-        <w:t xml:space="preserve">Idle</w:t>
-      </w:r>
-      <w:r>
-        <w:t xml:space="preserve">/</w:t>
-      </w:r>
-      <w:r>
-        <w:rPr>
-          <w:rFonts w:ascii="Consolas" w:hAnsi="Consolas"/>
-        </w:rPr>
-        <w:t xml:space="preserve">Flow IAT</w:t>
-      </w:r>
-      <w:r>
-        <w:t xml:space="preserve"> statistics). Forcing one unconditional generator to cover many modes cost more than the extra data gained, so it does not generalise cleanly. A class-conditional GAN, or one model per attack family, is the obvious next step.</w:t>
-      </w:r>
-    </w:p>
-    <w:p>
-      <w:pPr>
-        <w:pStyle w:val="Heading1"/>
-      </w:pPr>
-      <w:r>
-        <w:t xml:space="preserve">5. Part 2.3: Creative AI - QuickDraw 'Birthday Cake' (DCGAN, TensorFlow/Keras)</w:t>
-      </w:r>
-    </w:p>
-    <w:p>
-      <w:r>
-        <w:rPr>
-          <w:b/>
-        </w:rPr>
-        <w:t xml:space="preserve">Dataset.</w:t>
-      </w:r>
-      <w:r>
-        <w:t xml:space="preserve"> QuickDraw (Ha and Eck, 2018; Google Creative Lab) provides 28x28 grayscale doodles as high-contrast line art on black. The birthday-cake category holds 144,982 sketches, typically a cake body, candles, and often a plate line.</w:t>
-      </w:r>
-    </w:p>
-    <w:p>
-      <w:r>
-        <w:rPr>
-          <w:b/>
-        </w:rPr>
-        <w:t xml:space="preserve">Model and training.</w:t>
-      </w:r>
-      <w:r>
-        <w:t xml:space="preserve"> A doodle is defined by where strokes go, i.e. local spatial structure, so the Part 2.1 DCGAN builders apply directly (reuse across such different domains is itself a good check). The only change is a larger 128-D latent vector for the greater shape variety. Training is Adam (lr = 2e-4) with label smoothing, 30,000 images, 50 epochs; the discriminator stays low (≈0.34-0.9) while the generator oscillates (1.3-6.1) with no collapse.</w:t>
+        <w:t xml:space="preserve">URG Flag Count</w:t>
+      </w:r>
+      <w:r>
+        <w:t xml:space="preserve"> and </w:t>
+      </w:r>
+      <w:r>
+        <w:rPr>
+          <w:rFonts w:ascii="Consolas" w:hAnsi="Consolas"/>
+        </w:rPr>
+        <w:t xml:space="preserve">Fwd PSH Flags</w:t>
+      </w:r>
+      <w:r>
+        <w:t xml:space="preserve">. For the near-binary flags the generated std almost vanishes (</w:t>
+      </w:r>
+      <w:r>
+        <w:rPr>
+          <w:rFonts w:ascii="Consolas" w:hAnsi="Consolas"/>
+        </w:rPr>
+        <w:t xml:space="preserve">URG Flag Count</w:t>
+      </w:r>
+      <w:r>
+        <w:t xml:space="preserve"> 0.030, </w:t>
+      </w:r>
+      <w:r>
+        <w:rPr>
+          <w:rFonts w:ascii="Consolas" w:hAnsi="Consolas"/>
+        </w:rPr>
+        <w:t xml:space="preserve">Fwd PSH Flags</w:t>
+      </w:r>
+      <w:r>
+        <w:t xml:space="preserve"> 0.024, versus real ≈0.9-1.0), so the generator pins them to a constant, partial mode collapse on the discrete features.</w:t>
+      </w:r>
+    </w:p>
+    <w:p>
+      <w:r>
+        <w:rPr>
+          <w:b/>
+        </w:rPr>
+        <w:t xml:space="preserve">Reflection (security).</w:t>
+      </w:r>
+      <w:r>
+        <w:t xml:space="preserve"> The hallucination problem bites harder here: a generated flow only has to look like traffic, a far weaker bar than matching a real attack's timing, packet structure and flag sequences. Used to augment an IDS, a fabricated "attack" matching no real signature could teach the model to miss genuine attacks, while a fabricated "benign" flow drifting attack-ward could raise false positives. Unlike the OCT case there is no visual sanity check for 78 numbers, so the burden falls on quantitative checks that, as the flag collapse shows, can look fine while hiding a behavioural failure. One clarification: the Wednesday file contains </w:t>
+      </w:r>
+      <w:r>
+        <w:rPr>
+          <w:b/>
+        </w:rPr>
+        <w:t xml:space="preserve">DoS</w:t>
+      </w:r>
+      <w:r>
+        <w:t xml:space="preserve"> variants, not DDoS, despite the brief's wording; genuine DDoS is in the Friday file, used below.</w:t>
       </w:r>
     </w:p>
     <w:p>
@@ -828,7 +735,7 @@
           <w:i/>
           <w:color w:val="777777"/>
         </w:rPr>
-        <w:t xml:space="preserve">[ insert figure image: quickdraw_real_vs_fake.png  |  quickdraw_progression.png ]</w:t>
+        <w:t xml:space="preserve">[ insert figure image: pca_full_dataset_by_attack_type.png ]</w:t>
       </w:r>
     </w:p>
     <w:p>
@@ -843,19 +750,103 @@
         <w:rPr>
           <w:i/>
         </w:rPr>
-        <w:t xml:space="preserve"> Left: real vs generated cake sketches. Right: generated samples across epochs (1, 13, 26, 38, 50).</w:t>
-      </w:r>
-      <w:r>
-        <w:t xml:space="preserve"> The progression shows the outline and candles appearing early and then sharpening over training. The final cakes are easy to read and vary across the grid (no mode collapse); flaws are the usual line-art ones, broken or doubled strokes and slight speckle. The FID is </w:t>
-      </w:r>
-      <w:r>
-        <w:rPr>
-          <w:b/>
-        </w:rPr>
-        <w:t xml:space="preserve">42.67</w:t>
-      </w:r>
-      <w:r>
-        <w:t xml:space="preserve">, notably better than the OCT scans' 79.02, fitting the intuition that clean line art on a plain background sits more comfortably in InceptionV3's feature space than soft medical texture.</w:t>
+        <w:t xml:space="preserve"> All-days PCA coloured by attack type (left) and real-vs-generated (right).</w:t>
+      </w:r>
+      <w:r>
+        <w:t xml:space="preserve"> Combining all eight days (with per-file capping) gives 125,310 rows over every attack family. The generator covers the dense centre (BENIGN, DoS Hulk, true DDoS) but under-represents the smaller clusters. Tellingly, adding diversity made alignment </w:t>
+      </w:r>
+      <w:r>
+        <w:rPr>
+          <w:b/>
+        </w:rPr>
+        <w:t xml:space="preserve">worse</w:t>
+      </w:r>
+      <w:r>
+        <w:t xml:space="preserve">: mean |mean error| rose 0.0723 → </w:t>
+      </w:r>
+      <w:r>
+        <w:rPr>
+          <w:b/>
+        </w:rPr>
+        <w:t xml:space="preserve">0.1300</w:t>
+      </w:r>
+      <w:r>
+        <w:t xml:space="preserve"> and mean |std error| 0.3179 → </w:t>
+      </w:r>
+      <w:r>
+        <w:rPr>
+          <w:b/>
+        </w:rPr>
+        <w:t xml:space="preserve">0.4670</w:t>
+      </w:r>
+      <w:r>
+        <w:t xml:space="preserve">, now dominated by the timing family (</w:t>
+      </w:r>
+      <w:r>
+        <w:rPr>
+          <w:rFonts w:ascii="Consolas" w:hAnsi="Consolas"/>
+        </w:rPr>
+        <w:t xml:space="preserve">Flow Duration</w:t>
+      </w:r>
+      <w:r>
+        <w:t xml:space="preserve">, </w:t>
+      </w:r>
+      <w:r>
+        <w:rPr>
+          <w:rFonts w:ascii="Consolas" w:hAnsi="Consolas"/>
+        </w:rPr>
+        <w:t xml:space="preserve">Fwd IAT Total</w:t>
+      </w:r>
+      <w:r>
+        <w:t xml:space="preserve">, </w:t>
+      </w:r>
+      <w:r>
+        <w:rPr>
+          <w:rFonts w:ascii="Consolas" w:hAnsi="Consolas"/>
+        </w:rPr>
+        <w:t xml:space="preserve">Idle</w:t>
+      </w:r>
+      <w:r>
+        <w:t xml:space="preserve">/</w:t>
+      </w:r>
+      <w:r>
+        <w:rPr>
+          <w:rFonts w:ascii="Consolas" w:hAnsi="Consolas"/>
+        </w:rPr>
+        <w:t xml:space="preserve">Flow IAT</w:t>
+      </w:r>
+      <w:r>
+        <w:t xml:space="preserve"> statistics). Forcing one unconditional generator to cover many modes cost more than the extra data gained, so it does not generalise cleanly. A class-conditional GAN, or one model per attack family, is the obvious next step.</w:t>
+      </w:r>
+    </w:p>
+    <w:p>
+      <w:pPr>
+        <w:pStyle w:val="Heading1"/>
+      </w:pPr>
+      <w:r>
+        <w:t xml:space="preserve">5. Part 2.3: Creative AI - QuickDraw 'Birthday Cake' (DCGAN, TensorFlow/Keras)</w:t>
+      </w:r>
+    </w:p>
+    <w:p>
+      <w:r>
+        <w:rPr>
+          <w:b/>
+        </w:rPr>
+        <w:t xml:space="preserve">Dataset.</w:t>
+      </w:r>
+      <w:r>
+        <w:t xml:space="preserve"> QuickDraw (Ha and Eck, 2018; Google Creative Lab) provides 28x28 grayscale doodles as high-contrast line art on black. The birthday-cake category holds 144,982 sketches, typically a cake body, candles, and often a plate line.</w:t>
+      </w:r>
+    </w:p>
+    <w:p>
+      <w:r>
+        <w:rPr>
+          <w:b/>
+        </w:rPr>
+        <w:t xml:space="preserve">Model and training.</w:t>
+      </w:r>
+      <w:r>
+        <w:t xml:space="preserve"> A doodle is defined by where strokes go, i.e. local spatial structure, so the Part 2.1 DCGAN builders apply directly (reuse across such different domains is itself a good check). The only change is a larger 128-D latent vector for the greater shape variety. Training is Adam (lr = 2e-4) with label smoothing, 30,000 images, 50 epochs; the discriminator stays low (≈0.34-0.9) while the generator oscillates (1.3-6.1) with no collapse.</w:t>
       </w:r>
     </w:p>
     <w:p>
@@ -873,6 +864,87 @@
           <w:i/>
           <w:color w:val="777777"/>
         </w:rPr>
+        <w:t xml:space="preserve">[ insert figure image: quickdraw_real_vs_fake.png ]</w:t>
+      </w:r>
+    </w:p>
+    <w:p>
+      <w:r>
+        <w:rPr>
+          <w:b/>
+          <w:i/>
+        </w:rPr>
+        <w:t xml:space="preserve">Figure 8.</w:t>
+      </w:r>
+      <w:r>
+        <w:rPr>
+          <w:i/>
+        </w:rPr>
+        <w:t xml:space="preserve"> Real (left) vs generated (right) birthday-cake sketches.</w:t>
+      </w:r>
+      <w:r>
+        <w:t xml:space="preserve"> The final cakes are easy to read and vary across the grid (no mode collapse); flaws are the usual line-art ones, broken or doubled strokes and slight speckle. The FID is </w:t>
+      </w:r>
+      <w:r>
+        <w:rPr>
+          <w:b/>
+        </w:rPr>
+        <w:t xml:space="preserve">42.67</w:t>
+      </w:r>
+      <w:r>
+        <w:t xml:space="preserve">, notably better than the OCT scans' 79.02, fitting the intuition that clean line art on a plain background sits more comfortably in InceptionV3's feature space than soft medical texture.</w:t>
+      </w:r>
+    </w:p>
+    <w:p>
+      <w:pPr>
+        <w:jc w:val="center"/>
+        <w:pBdr>
+          <w:top w:val="single" w:sz="6" w:space="4" w:color="AAAAAA"/>
+          <w:bottom w:val="single" w:sz="6" w:space="4" w:color="AAAAAA"/>
+          <w:left w:val="single" w:sz="6" w:space="4" w:color="AAAAAA"/>
+          <w:right w:val="single" w:sz="6" w:space="4" w:color="AAAAAA"/>
+        </w:pBdr>
+      </w:pPr>
+      <w:r>
+        <w:rPr>
+          <w:i/>
+          <w:color w:val="777777"/>
+        </w:rPr>
+        <w:t xml:space="preserve">[ insert figure image: quickdraw_progression.png ]</w:t>
+      </w:r>
+    </w:p>
+    <w:p>
+      <w:r>
+        <w:rPr>
+          <w:b/>
+          <w:i/>
+        </w:rPr>
+        <w:t xml:space="preserve">Figure 9.</w:t>
+      </w:r>
+      <w:r>
+        <w:rPr>
+          <w:i/>
+        </w:rPr>
+        <w:t xml:space="preserve"> Generated cake samples across epochs (1, 13, 26, 38, 50).</w:t>
+      </w:r>
+      <w:r>
+        <w:t xml:space="preserve"> The progression shows the outline and candles appearing early in training and then sharpening, evidence that the generator is learning the cake structure rather than memorising it.</w:t>
+      </w:r>
+    </w:p>
+    <w:p>
+      <w:pPr>
+        <w:jc w:val="center"/>
+        <w:pBdr>
+          <w:top w:val="single" w:sz="6" w:space="4" w:color="AAAAAA"/>
+          <w:bottom w:val="single" w:sz="6" w:space="4" w:color="AAAAAA"/>
+          <w:left w:val="single" w:sz="6" w:space="4" w:color="AAAAAA"/>
+          <w:right w:val="single" w:sz="6" w:space="4" w:color="AAAAAA"/>
+        </w:pBdr>
+      </w:pPr>
+      <w:r>
+        <w:rPr>
+          <w:i/>
+          <w:color w:val="777777"/>
+        </w:rPr>
         <w:t xml:space="preserve">[ insert figure image: quickdraw_extension_complexity.png ]</w:t>
       </w:r>
     </w:p>
@@ -882,7 +954,7 @@
           <w:b/>
           <w:i/>
         </w:rPr>
-        <w:t xml:space="preserve">Figure 8.</w:t>
+        <w:t xml:space="preserve">Figure 10.</w:t>
       </w:r>
       <w:r>
         <w:rPr>

</xml_diff>

<commit_message>
Add 3 figures (OCT epoch progression, CICIDS t-SNE, QuickDraw losses); embed all 13 images in DOCX
- New Figure 5 (OCT samples across epochs), Figure 8 (t-SNE real vs generated),
  Figure 10 (QuickDraw loss curves); renumber to 13 figures
- Extract all 13 figures directly from notebook cell outputs into images/ so
  the DOCX embeds real images (no converter drop) and the .md renders on GitHub
- Rebuild GAN_Assignment_Report.docx with all 13 images embedded (1.2 MB)
</commit_message>
<xml_diff>
--- a/GAN_Assignment_Report.docx
+++ b/GAN_Assignment_Report.docx
@@ -1,6 +1,6 @@
 
 <file path=word/document.xml><?xml version="1.0" encoding="utf-8"?>
-<w:document xmlns:w="http://schemas.openxmlformats.org/wordprocessingml/2006/main">
+<w:document xmlns:w="http://schemas.openxmlformats.org/wordprocessingml/2006/main" xmlns:r="http://schemas.openxmlformats.org/officeDocument/2006/relationships" xmlns:wp="http://schemas.openxmlformats.org/drawingml/2006/wordprocessingDrawing" xmlns:a="http://schemas.openxmlformats.org/drawingml/2006/main" xmlns:pic="http://schemas.openxmlformats.org/drawingml/2006/picture">
   <w:body>
     <w:p>
       <w:pPr>
@@ -104,19 +104,42 @@
     <w:p>
       <w:pPr>
         <w:jc w:val="center"/>
-        <w:pBdr>
-          <w:top w:val="single" w:sz="6" w:space="4" w:color="AAAAAA"/>
-          <w:bottom w:val="single" w:sz="6" w:space="4" w:color="AAAAAA"/>
-          <w:left w:val="single" w:sz="6" w:space="4" w:color="AAAAAA"/>
-          <w:right w:val="single" w:sz="6" w:space="4" w:color="AAAAAA"/>
-        </w:pBdr>
       </w:pPr>
       <w:r>
-        <w:rPr>
-          <w:i/>
-          <w:color w:val="777777"/>
-        </w:rPr>
-        <w:t xml:space="preserve">[ insert figure image: sine_real_vs_fake.png ]</w:t>
+        <w:drawing>
+          <wp:inline distT="0" distB="0" distL="0" distR="0">
+            <wp:extent cx="3152330" cy="2680674"/>
+            <wp:docPr id="1" name="sine_real_vs_fake.png"/>
+            <wp:cNvGraphicFramePr>
+              <a:graphicFrameLocks xmlns:a="http://schemas.openxmlformats.org/drawingml/2006/main" noChangeAspect="1"/>
+            </wp:cNvGraphicFramePr>
+            <a:graphic xmlns:a="http://schemas.openxmlformats.org/drawingml/2006/main">
+              <a:graphicData uri="http://schemas.openxmlformats.org/drawingml/2006/picture">
+                <pic:pic xmlns:pic="http://schemas.openxmlformats.org/drawingml/2006/picture">
+                  <pic:nvPicPr>
+                    <pic:cNvPr id="1" name="sine_real_vs_fake.png"/>
+                    <pic:cNvPicPr/>
+                  </pic:nvPicPr>
+                  <pic:blipFill>
+                    <a:blip r:embed="rIdImg1"/>
+                    <a:stretch>
+                      <a:fillRect/>
+                    </a:stretch>
+                  </pic:blipFill>
+                  <pic:spPr>
+                    <a:xfrm>
+                      <a:off x="0" y="0"/>
+                      <a:ext cx="3152330" cy="2680674"/>
+                    </a:xfrm>
+                    <a:prstGeom prst="rect">
+                      <a:avLst/>
+                    </a:prstGeom>
+                  </pic:spPr>
+                </pic:pic>
+              </a:graphicData>
+            </a:graphic>
+          </wp:inline>
+        </w:drawing>
       </w:r>
     </w:p>
     <w:p>
@@ -198,19 +221,42 @@
     <w:p>
       <w:pPr>
         <w:jc w:val="center"/>
-        <w:pBdr>
-          <w:top w:val="single" w:sz="6" w:space="4" w:color="AAAAAA"/>
-          <w:bottom w:val="single" w:sz="6" w:space="4" w:color="AAAAAA"/>
-          <w:left w:val="single" w:sz="6" w:space="4" w:color="AAAAAA"/>
-          <w:right w:val="single" w:sz="6" w:space="4" w:color="AAAAAA"/>
-        </w:pBdr>
       </w:pPr>
       <w:r>
-        <w:rPr>
-          <w:i/>
-          <w:color w:val="777777"/>
-        </w:rPr>
-        <w:t xml:space="preserve">[ insert figure image: task3_comparison.png ]</w:t>
+        <w:drawing>
+          <wp:inline distT="0" distB="0" distL="0" distR="0">
+            <wp:extent cx="5158359" cy="1697512"/>
+            <wp:docPr id="2" name="task3_comparison.png"/>
+            <wp:cNvGraphicFramePr>
+              <a:graphicFrameLocks xmlns:a="http://schemas.openxmlformats.org/drawingml/2006/main" noChangeAspect="1"/>
+            </wp:cNvGraphicFramePr>
+            <a:graphic xmlns:a="http://schemas.openxmlformats.org/drawingml/2006/main">
+              <a:graphicData uri="http://schemas.openxmlformats.org/drawingml/2006/picture">
+                <pic:pic xmlns:pic="http://schemas.openxmlformats.org/drawingml/2006/picture">
+                  <pic:nvPicPr>
+                    <pic:cNvPr id="2" name="task3_comparison.png"/>
+                    <pic:cNvPicPr/>
+                  </pic:nvPicPr>
+                  <pic:blipFill>
+                    <a:blip r:embed="rIdImg2"/>
+                    <a:stretch>
+                      <a:fillRect/>
+                    </a:stretch>
+                  </pic:blipFill>
+                  <pic:spPr>
+                    <a:xfrm>
+                      <a:off x="0" y="0"/>
+                      <a:ext cx="5158359" cy="1697512"/>
+                    </a:xfrm>
+                    <a:prstGeom prst="rect">
+                      <a:avLst/>
+                    </a:prstGeom>
+                  </pic:spPr>
+                </pic:pic>
+              </a:graphicData>
+            </a:graphic>
+          </wp:inline>
+        </w:drawing>
       </w:r>
     </w:p>
     <w:p>
@@ -336,19 +382,42 @@
     <w:p>
       <w:pPr>
         <w:jc w:val="center"/>
-        <w:pBdr>
-          <w:top w:val="single" w:sz="6" w:space="4" w:color="AAAAAA"/>
-          <w:bottom w:val="single" w:sz="6" w:space="4" w:color="AAAAAA"/>
-          <w:left w:val="single" w:sz="6" w:space="4" w:color="AAAAAA"/>
-          <w:right w:val="single" w:sz="6" w:space="4" w:color="AAAAAA"/>
-        </w:pBdr>
       </w:pPr>
       <w:r>
-        <w:rPr>
-          <w:i/>
-          <w:color w:val="777777"/>
-        </w:rPr>
-        <w:t xml:space="preserve">[ insert figure image: octmnist_real_vs_fake.png ]</w:t>
+        <w:drawing>
+          <wp:inline distT="0" distB="0" distL="0" distR="0">
+            <wp:extent cx="3438906" cy="1889588"/>
+            <wp:docPr id="3" name="octmnist_real_vs_fake.png"/>
+            <wp:cNvGraphicFramePr>
+              <a:graphicFrameLocks xmlns:a="http://schemas.openxmlformats.org/drawingml/2006/main" noChangeAspect="1"/>
+            </wp:cNvGraphicFramePr>
+            <a:graphic xmlns:a="http://schemas.openxmlformats.org/drawingml/2006/main">
+              <a:graphicData uri="http://schemas.openxmlformats.org/drawingml/2006/picture">
+                <pic:pic xmlns:pic="http://schemas.openxmlformats.org/drawingml/2006/picture">
+                  <pic:nvPicPr>
+                    <pic:cNvPr id="3" name="octmnist_real_vs_fake.png"/>
+                    <pic:cNvPicPr/>
+                  </pic:nvPicPr>
+                  <pic:blipFill>
+                    <a:blip r:embed="rIdImg3"/>
+                    <a:stretch>
+                      <a:fillRect/>
+                    </a:stretch>
+                  </pic:blipFill>
+                  <pic:spPr>
+                    <a:xfrm>
+                      <a:off x="0" y="0"/>
+                      <a:ext cx="3438906" cy="1889588"/>
+                    </a:xfrm>
+                    <a:prstGeom prst="rect">
+                      <a:avLst/>
+                    </a:prstGeom>
+                  </pic:spPr>
+                </pic:pic>
+              </a:graphicData>
+            </a:graphic>
+          </wp:inline>
+        </w:drawing>
       </w:r>
     </w:p>
     <w:p>
@@ -381,19 +450,42 @@
     <w:p>
       <w:pPr>
         <w:jc w:val="center"/>
-        <w:pBdr>
-          <w:top w:val="single" w:sz="6" w:space="4" w:color="AAAAAA"/>
-          <w:bottom w:val="single" w:sz="6" w:space="4" w:color="AAAAAA"/>
-          <w:left w:val="single" w:sz="6" w:space="4" w:color="AAAAAA"/>
-          <w:right w:val="single" w:sz="6" w:space="4" w:color="AAAAAA"/>
-        </w:pBdr>
       </w:pPr>
       <w:r>
-        <w:rPr>
-          <w:i/>
-          <w:color w:val="777777"/>
-        </w:rPr>
-        <w:t xml:space="preserve">[ insert figure image: octmnist_loss_curves.png ]</w:t>
+        <w:drawing>
+          <wp:inline distT="0" distB="0" distL="0" distR="0">
+            <wp:extent cx="3438906" cy="1983203"/>
+            <wp:docPr id="4" name="octmnist_loss_curves.png"/>
+            <wp:cNvGraphicFramePr>
+              <a:graphicFrameLocks xmlns:a="http://schemas.openxmlformats.org/drawingml/2006/main" noChangeAspect="1"/>
+            </wp:cNvGraphicFramePr>
+            <a:graphic xmlns:a="http://schemas.openxmlformats.org/drawingml/2006/main">
+              <a:graphicData uri="http://schemas.openxmlformats.org/drawingml/2006/picture">
+                <pic:pic xmlns:pic="http://schemas.openxmlformats.org/drawingml/2006/picture">
+                  <pic:nvPicPr>
+                    <pic:cNvPr id="4" name="octmnist_loss_curves.png"/>
+                    <pic:cNvPicPr/>
+                  </pic:nvPicPr>
+                  <pic:blipFill>
+                    <a:blip r:embed="rIdImg4"/>
+                    <a:stretch>
+                      <a:fillRect/>
+                    </a:stretch>
+                  </pic:blipFill>
+                  <pic:spPr>
+                    <a:xfrm>
+                      <a:off x="0" y="0"/>
+                      <a:ext cx="3438906" cy="1983203"/>
+                    </a:xfrm>
+                    <a:prstGeom prst="rect">
+                      <a:avLst/>
+                    </a:prstGeom>
+                  </pic:spPr>
+                </pic:pic>
+              </a:graphicData>
+            </a:graphic>
+          </wp:inline>
+        </w:drawing>
       </w:r>
     </w:p>
     <w:p>
@@ -412,55 +504,47 @@
       </w:r>
       <w:r>
         <w:t xml:space="preserve"> The discriminator loss stays low (≈0.4-0.6) while the generator oscillates in the 2-5 range without collapsing, a discriminator that keeps a modest edge but never wins outright, so the generator kept receiving usable gradient across all 60 epochs.</w:t>
-      </w:r>
-    </w:p>
-    <w:p>
-      <w:r>
-        <w:rPr>
-          <w:b/>
-        </w:rPr>
-        <w:t xml:space="preserve">Reflection ("looks real vs is true").</w:t>
-      </w:r>
-      <w:r>
-        <w:t xml:space="preserve"> The discriminator only ever answers "real or fake"; nothing checks that a generated structure is physiologically valid. The generator can therefore invent a bright band or lesion-like patch that never occurred in a real patient, as long as it looks plausible, this is the hazard of treating GAN output as data. A hallucinated region could mimic disease that is absent, or smooth over a real anomaly, so a synthetic scan must never be used diagnostically. The defensible uses are augmentation and teaching, and any model trained on synthetic scans should be validated on a real-only holdout to confirm it has not just learned to spot GAN artefacts.</w:t>
-      </w:r>
-    </w:p>
-    <w:p>
-      <w:r>
-        <w:rPr>
-          <w:b/>
-        </w:rPr>
-        <w:t xml:space="preserve">Extension: conditional GAN.</w:t>
-      </w:r>
-      <w:r>
-        <w:t xml:space="preserve"> The unconditional model cannot be asked for a specific class. A conditional GAN (Mirza and Osindero, 2014) feeds the label into both networks (embedded and concatenated with the latent vector for the generator; embedded as an extra image channel for the discriminator), forcing realism </w:t>
-      </w:r>
-      <w:r>
-        <w:rPr>
-          <w:i/>
-        </w:rPr>
-        <w:t xml:space="preserve">per class</w:t>
-      </w:r>
-      <w:r>
-        <w:t xml:space="preserve">. Each class is oversampled to balance the data, and the discriminator uses a slower learning rate, a two-time-scale update that stabilises training (Heusel et al., 2017).</w:t>
       </w:r>
     </w:p>
     <w:p>
       <w:pPr>
         <w:jc w:val="center"/>
-        <w:pBdr>
-          <w:top w:val="single" w:sz="6" w:space="4" w:color="AAAAAA"/>
-          <w:bottom w:val="single" w:sz="6" w:space="4" w:color="AAAAAA"/>
-          <w:left w:val="single" w:sz="6" w:space="4" w:color="AAAAAA"/>
-          <w:right w:val="single" w:sz="6" w:space="4" w:color="AAAAAA"/>
-        </w:pBdr>
       </w:pPr>
       <w:r>
-        <w:rPr>
-          <w:i/>
-          <w:color w:val="777777"/>
-        </w:rPr>
-        <w:t xml:space="preserve">[ insert figure image: octmnist_cgan_per_class.png ]</w:t>
+        <w:drawing>
+          <wp:inline distT="0" distB="0" distL="0" distR="0">
+            <wp:extent cx="5158359" cy="1200125"/>
+            <wp:docPr id="5" name="octmnist_progression.png"/>
+            <wp:cNvGraphicFramePr>
+              <a:graphicFrameLocks xmlns:a="http://schemas.openxmlformats.org/drawingml/2006/main" noChangeAspect="1"/>
+            </wp:cNvGraphicFramePr>
+            <a:graphic xmlns:a="http://schemas.openxmlformats.org/drawingml/2006/main">
+              <a:graphicData uri="http://schemas.openxmlformats.org/drawingml/2006/picture">
+                <pic:pic xmlns:pic="http://schemas.openxmlformats.org/drawingml/2006/picture">
+                  <pic:nvPicPr>
+                    <pic:cNvPr id="5" name="octmnist_progression.png"/>
+                    <pic:cNvPicPr/>
+                  </pic:nvPicPr>
+                  <pic:blipFill>
+                    <a:blip r:embed="rIdImg5"/>
+                    <a:stretch>
+                      <a:fillRect/>
+                    </a:stretch>
+                  </pic:blipFill>
+                  <pic:spPr>
+                    <a:xfrm>
+                      <a:off x="0" y="0"/>
+                      <a:ext cx="5158359" cy="1200125"/>
+                    </a:xfrm>
+                    <a:prstGeom prst="rect">
+                      <a:avLst/>
+                    </a:prstGeom>
+                  </pic:spPr>
+                </pic:pic>
+              </a:graphicData>
+            </a:graphic>
+          </wp:inline>
+        </w:drawing>
       </w:r>
     </w:p>
     <w:p>
@@ -470,6 +554,96 @@
           <w:i/>
         </w:rPr>
         <w:t xml:space="preserve">Figure 5.</w:t>
+      </w:r>
+      <w:r>
+        <w:rPr>
+          <w:i/>
+        </w:rPr>
+        <w:t xml:space="preserve"> OCTMNIST DCGAN samples across epochs (1, 16, 30, 45, 60).</w:t>
+      </w:r>
+      <w:r>
+        <w:t xml:space="preserve"> Early snapshots are little more than random texture; a recognisable layered retinal band emerges by the middle epochs and then only sharpens slightly, which shows the generator is learning the scan structure progressively rather than latching onto a single memorised image.</w:t>
+      </w:r>
+    </w:p>
+    <w:p>
+      <w:r>
+        <w:rPr>
+          <w:b/>
+        </w:rPr>
+        <w:t xml:space="preserve">Reflection ("looks real vs is true").</w:t>
+      </w:r>
+      <w:r>
+        <w:t xml:space="preserve"> The discriminator only ever answers "real or fake"; nothing checks that a generated structure is physiologically valid. The generator can therefore invent a bright band or lesion-like patch that never occurred in a real patient, as long as it looks plausible, this is the hazard of treating GAN output as data. A hallucinated region could mimic disease that is absent, or smooth over a real anomaly, so a synthetic scan must never be used diagnostically. The defensible uses are augmentation and teaching, and any model trained on synthetic scans should be validated on a real-only holdout to confirm it has not just learned to spot GAN artefacts.</w:t>
+      </w:r>
+    </w:p>
+    <w:p>
+      <w:r>
+        <w:rPr>
+          <w:b/>
+        </w:rPr>
+        <w:t xml:space="preserve">Extension: conditional GAN.</w:t>
+      </w:r>
+      <w:r>
+        <w:t xml:space="preserve"> The unconditional model cannot be asked for a specific class. A conditional GAN (Mirza and Osindero, 2014) feeds the label into both networks (embedded and concatenated with the latent vector for the generator; embedded as an extra image channel for the discriminator), forcing realism </w:t>
+      </w:r>
+      <w:r>
+        <w:rPr>
+          <w:i/>
+        </w:rPr>
+        <w:t xml:space="preserve">per class</w:t>
+      </w:r>
+      <w:r>
+        <w:t xml:space="preserve">. Each class is oversampled to balance the data, and the discriminator uses a slower learning rate, a two-time-scale update that stabilises training (Heusel et al., 2017).</w:t>
+      </w:r>
+    </w:p>
+    <w:p>
+      <w:pPr>
+        <w:jc w:val="center"/>
+      </w:pPr>
+      <w:r>
+        <w:drawing>
+          <wp:inline distT="0" distB="0" distL="0" distR="0">
+            <wp:extent cx="3438906" cy="1971997"/>
+            <wp:docPr id="6" name="octmnist_cgan_per_class.png"/>
+            <wp:cNvGraphicFramePr>
+              <a:graphicFrameLocks xmlns:a="http://schemas.openxmlformats.org/drawingml/2006/main" noChangeAspect="1"/>
+            </wp:cNvGraphicFramePr>
+            <a:graphic xmlns:a="http://schemas.openxmlformats.org/drawingml/2006/main">
+              <a:graphicData uri="http://schemas.openxmlformats.org/drawingml/2006/picture">
+                <pic:pic xmlns:pic="http://schemas.openxmlformats.org/drawingml/2006/picture">
+                  <pic:nvPicPr>
+                    <pic:cNvPr id="6" name="octmnist_cgan_per_class.png"/>
+                    <pic:cNvPicPr/>
+                  </pic:nvPicPr>
+                  <pic:blipFill>
+                    <a:blip r:embed="rIdImg6"/>
+                    <a:stretch>
+                      <a:fillRect/>
+                    </a:stretch>
+                  </pic:blipFill>
+                  <pic:spPr>
+                    <a:xfrm>
+                      <a:off x="0" y="0"/>
+                      <a:ext cx="3438906" cy="1971997"/>
+                    </a:xfrm>
+                    <a:prstGeom prst="rect">
+                      <a:avLst/>
+                    </a:prstGeom>
+                  </pic:spPr>
+                </pic:pic>
+              </a:graphicData>
+            </a:graphic>
+          </wp:inline>
+        </w:drawing>
+      </w:r>
+    </w:p>
+    <w:p>
+      <w:r>
+        <w:rPr>
+          <w:b/>
+          <w:i/>
+        </w:rPr>
+        <w:t xml:space="preserve">Figure 6.</w:t>
       </w:r>
       <w:r>
         <w:rPr>
@@ -559,28 +733,51 @@
     <w:p>
       <w:pPr>
         <w:jc w:val="center"/>
-        <w:pBdr>
-          <w:top w:val="single" w:sz="6" w:space="4" w:color="AAAAAA"/>
-          <w:bottom w:val="single" w:sz="6" w:space="4" w:color="AAAAAA"/>
-          <w:left w:val="single" w:sz="6" w:space="4" w:color="AAAAAA"/>
-          <w:right w:val="single" w:sz="6" w:space="4" w:color="AAAAAA"/>
-        </w:pBdr>
       </w:pPr>
       <w:r>
-        <w:rPr>
-          <w:i/>
-          <w:color w:val="777777"/>
-        </w:rPr>
-        <w:t xml:space="preserve">[ insert figure image: pca_real_vs_fake.png ]</w:t>
-      </w:r>
-    </w:p>
-    <w:p>
-      <w:r>
-        <w:rPr>
-          <w:b/>
-          <w:i/>
-        </w:rPr>
-        <w:t xml:space="preserve">Figure 6.</w:t>
+        <w:drawing>
+          <wp:inline distT="0" distB="0" distL="0" distR="0">
+            <wp:extent cx="2980385" cy="2628333"/>
+            <wp:docPr id="7" name="pca_real_vs_fake.png"/>
+            <wp:cNvGraphicFramePr>
+              <a:graphicFrameLocks xmlns:a="http://schemas.openxmlformats.org/drawingml/2006/main" noChangeAspect="1"/>
+            </wp:cNvGraphicFramePr>
+            <a:graphic xmlns:a="http://schemas.openxmlformats.org/drawingml/2006/main">
+              <a:graphicData uri="http://schemas.openxmlformats.org/drawingml/2006/picture">
+                <pic:pic xmlns:pic="http://schemas.openxmlformats.org/drawingml/2006/picture">
+                  <pic:nvPicPr>
+                    <pic:cNvPr id="7" name="pca_real_vs_fake.png"/>
+                    <pic:cNvPicPr/>
+                  </pic:nvPicPr>
+                  <pic:blipFill>
+                    <a:blip r:embed="rIdImg7"/>
+                    <a:stretch>
+                      <a:fillRect/>
+                    </a:stretch>
+                  </pic:blipFill>
+                  <pic:spPr>
+                    <a:xfrm>
+                      <a:off x="0" y="0"/>
+                      <a:ext cx="2980385" cy="2628333"/>
+                    </a:xfrm>
+                    <a:prstGeom prst="rect">
+                      <a:avLst/>
+                    </a:prstGeom>
+                  </pic:spPr>
+                </pic:pic>
+              </a:graphicData>
+            </a:graphic>
+          </wp:inline>
+        </w:drawing>
+      </w:r>
+    </w:p>
+    <w:p>
+      <w:r>
+        <w:rPr>
+          <w:b/>
+          <w:i/>
+        </w:rPr>
+        <w:t xml:space="preserve">Figure 7.</w:t>
       </w:r>
       <w:r>
         <w:rPr>
@@ -698,53 +895,135 @@
       </w:r>
       <w:r>
         <w:t xml:space="preserve"> 0.024, versus real ≈0.9-1.0), so the generator pins them to a constant, partial mode collapse on the discrete features.</w:t>
-      </w:r>
-    </w:p>
-    <w:p>
-      <w:r>
-        <w:rPr>
-          <w:b/>
-        </w:rPr>
-        <w:t xml:space="preserve">Reflection (security).</w:t>
-      </w:r>
-      <w:r>
-        <w:t xml:space="preserve"> The hallucination problem bites harder here: a generated flow only has to look like traffic, a far weaker bar than matching a real attack's timing, packet structure and flag sequences. Used to augment an IDS, a fabricated "attack" matching no real signature could teach the model to miss genuine attacks, while a fabricated "benign" flow drifting attack-ward could raise false positives. Unlike the OCT case there is no visual sanity check for 78 numbers, so the burden falls on quantitative checks that, as the flag collapse shows, can look fine while hiding a behavioural failure. One clarification: the Wednesday file contains </w:t>
-      </w:r>
-      <w:r>
-        <w:rPr>
-          <w:b/>
-        </w:rPr>
-        <w:t xml:space="preserve">DoS</w:t>
-      </w:r>
-      <w:r>
-        <w:t xml:space="preserve"> variants, not DDoS, despite the brief's wording; genuine DDoS is in the Friday file, used below.</w:t>
       </w:r>
     </w:p>
     <w:p>
       <w:pPr>
         <w:jc w:val="center"/>
-        <w:pBdr>
-          <w:top w:val="single" w:sz="6" w:space="4" w:color="AAAAAA"/>
-          <w:bottom w:val="single" w:sz="6" w:space="4" w:color="AAAAAA"/>
-          <w:left w:val="single" w:sz="6" w:space="4" w:color="AAAAAA"/>
-          <w:right w:val="single" w:sz="6" w:space="4" w:color="AAAAAA"/>
-        </w:pBdr>
       </w:pPr>
       <w:r>
-        <w:rPr>
-          <w:i/>
-          <w:color w:val="777777"/>
-        </w:rPr>
-        <w:t xml:space="preserve">[ insert figure image: pca_full_dataset_by_attack_type.png ]</w:t>
-      </w:r>
-    </w:p>
-    <w:p>
-      <w:r>
-        <w:rPr>
-          <w:b/>
-          <w:i/>
-        </w:rPr>
-        <w:t xml:space="preserve">Figure 7.</w:t>
+        <w:drawing>
+          <wp:inline distT="0" distB="0" distL="0" distR="0">
+            <wp:extent cx="3152330" cy="2758944"/>
+            <wp:docPr id="8" name="tsne_real_vs_fake.png"/>
+            <wp:cNvGraphicFramePr>
+              <a:graphicFrameLocks xmlns:a="http://schemas.openxmlformats.org/drawingml/2006/main" noChangeAspect="1"/>
+            </wp:cNvGraphicFramePr>
+            <a:graphic xmlns:a="http://schemas.openxmlformats.org/drawingml/2006/main">
+              <a:graphicData uri="http://schemas.openxmlformats.org/drawingml/2006/picture">
+                <pic:pic xmlns:pic="http://schemas.openxmlformats.org/drawingml/2006/picture">
+                  <pic:nvPicPr>
+                    <pic:cNvPr id="8" name="tsne_real_vs_fake.png"/>
+                    <pic:cNvPicPr/>
+                  </pic:nvPicPr>
+                  <pic:blipFill>
+                    <a:blip r:embed="rIdImg8"/>
+                    <a:stretch>
+                      <a:fillRect/>
+                    </a:stretch>
+                  </pic:blipFill>
+                  <pic:spPr>
+                    <a:xfrm>
+                      <a:off x="0" y="0"/>
+                      <a:ext cx="3152330" cy="2758944"/>
+                    </a:xfrm>
+                    <a:prstGeom prst="rect">
+                      <a:avLst/>
+                    </a:prstGeom>
+                  </pic:spPr>
+                </pic:pic>
+              </a:graphicData>
+            </a:graphic>
+          </wp:inline>
+        </w:drawing>
+      </w:r>
+    </w:p>
+    <w:p>
+      <w:r>
+        <w:rPr>
+          <w:b/>
+          <w:i/>
+        </w:rPr>
+        <w:t xml:space="preserve">Figure 8.</w:t>
+      </w:r>
+      <w:r>
+        <w:rPr>
+          <w:i/>
+        </w:rPr>
+        <w:t xml:space="preserve"> t-SNE of real (blue) vs generated (red) flow vectors.</w:t>
+      </w:r>
+      <w:r>
+        <w:t xml:space="preserve"> t-SNE pulls apart local clusters that PCA tends to blur together, and the generated points still sit on the main real clusters while packing a little more tightly, the same story the alignment numbers tell: the bulk of the distribution is covered but the spread is slightly under-produced.</w:t>
+      </w:r>
+    </w:p>
+    <w:p>
+      <w:r>
+        <w:rPr>
+          <w:b/>
+        </w:rPr>
+        <w:t xml:space="preserve">Reflection (security).</w:t>
+      </w:r>
+      <w:r>
+        <w:t xml:space="preserve"> The hallucination problem bites harder here: a generated flow only has to look like traffic, a far weaker bar than matching a real attack's timing, packet structure and flag sequences. Used to augment an IDS, a fabricated "attack" matching no real signature could teach the model to miss genuine attacks, while a fabricated "benign" flow drifting attack-ward could raise false positives. Unlike the OCT case there is no visual sanity check for 78 numbers, so the burden falls on quantitative checks that, as the flag collapse shows, can look fine while hiding a behavioural failure. One clarification: the Wednesday file contains </w:t>
+      </w:r>
+      <w:r>
+        <w:rPr>
+          <w:b/>
+        </w:rPr>
+        <w:t xml:space="preserve">DoS</w:t>
+      </w:r>
+      <w:r>
+        <w:t xml:space="preserve"> variants, not DDoS, despite the brief's wording; genuine DDoS is in the Friday file, used below.</w:t>
+      </w:r>
+    </w:p>
+    <w:p>
+      <w:pPr>
+        <w:jc w:val="center"/>
+      </w:pPr>
+      <w:r>
+        <w:drawing>
+          <wp:inline distT="0" distB="0" distL="0" distR="0">
+            <wp:extent cx="5158359" cy="2355250"/>
+            <wp:docPr id="9" name="pca_full_dataset_by_attack_type.png"/>
+            <wp:cNvGraphicFramePr>
+              <a:graphicFrameLocks xmlns:a="http://schemas.openxmlformats.org/drawingml/2006/main" noChangeAspect="1"/>
+            </wp:cNvGraphicFramePr>
+            <a:graphic xmlns:a="http://schemas.openxmlformats.org/drawingml/2006/main">
+              <a:graphicData uri="http://schemas.openxmlformats.org/drawingml/2006/picture">
+                <pic:pic xmlns:pic="http://schemas.openxmlformats.org/drawingml/2006/picture">
+                  <pic:nvPicPr>
+                    <pic:cNvPr id="9" name="pca_full_dataset_by_attack_type.png"/>
+                    <pic:cNvPicPr/>
+                  </pic:nvPicPr>
+                  <pic:blipFill>
+                    <a:blip r:embed="rIdImg9"/>
+                    <a:stretch>
+                      <a:fillRect/>
+                    </a:stretch>
+                  </pic:blipFill>
+                  <pic:spPr>
+                    <a:xfrm>
+                      <a:off x="0" y="0"/>
+                      <a:ext cx="5158359" cy="2355250"/>
+                    </a:xfrm>
+                    <a:prstGeom prst="rect">
+                      <a:avLst/>
+                    </a:prstGeom>
+                  </pic:spPr>
+                </pic:pic>
+              </a:graphicData>
+            </a:graphic>
+          </wp:inline>
+        </w:drawing>
+      </w:r>
+    </w:p>
+    <w:p>
+      <w:r>
+        <w:rPr>
+          <w:b/>
+          <w:i/>
+        </w:rPr>
+        <w:t xml:space="preserve">Figure 9.</w:t>
       </w:r>
       <w:r>
         <w:rPr>
@@ -852,109 +1131,237 @@
     <w:p>
       <w:pPr>
         <w:jc w:val="center"/>
-        <w:pBdr>
-          <w:top w:val="single" w:sz="6" w:space="4" w:color="AAAAAA"/>
-          <w:bottom w:val="single" w:sz="6" w:space="4" w:color="AAAAAA"/>
-          <w:left w:val="single" w:sz="6" w:space="4" w:color="AAAAAA"/>
-          <w:right w:val="single" w:sz="6" w:space="4" w:color="AAAAAA"/>
-        </w:pBdr>
       </w:pPr>
       <w:r>
-        <w:rPr>
-          <w:i/>
-          <w:color w:val="777777"/>
-        </w:rPr>
-        <w:t xml:space="preserve">[ insert figure image: quickdraw_real_vs_fake.png ]</w:t>
-      </w:r>
-    </w:p>
-    <w:p>
-      <w:r>
-        <w:rPr>
-          <w:b/>
-          <w:i/>
-        </w:rPr>
-        <w:t xml:space="preserve">Figure 8.</w:t>
-      </w:r>
-      <w:r>
-        <w:rPr>
-          <w:i/>
-        </w:rPr>
-        <w:t xml:space="preserve"> Real (left) vs generated (right) birthday-cake sketches.</w:t>
-      </w:r>
-      <w:r>
-        <w:t xml:space="preserve"> The final cakes are easy to read and vary across the grid (no mode collapse); flaws are the usual line-art ones, broken or doubled strokes and slight speckle. The FID is </w:t>
-      </w:r>
-      <w:r>
-        <w:rPr>
-          <w:b/>
-        </w:rPr>
-        <w:t xml:space="preserve">42.67</w:t>
-      </w:r>
-      <w:r>
-        <w:t xml:space="preserve">, notably better than the OCT scans' 79.02, fitting the intuition that clean line art on a plain background sits more comfortably in InceptionV3's feature space than soft medical texture.</w:t>
+        <w:drawing>
+          <wp:inline distT="0" distB="0" distL="0" distR="0">
+            <wp:extent cx="3438906" cy="1934693"/>
+            <wp:docPr id="10" name="quickdraw_loss_curves.png"/>
+            <wp:cNvGraphicFramePr>
+              <a:graphicFrameLocks xmlns:a="http://schemas.openxmlformats.org/drawingml/2006/main" noChangeAspect="1"/>
+            </wp:cNvGraphicFramePr>
+            <a:graphic xmlns:a="http://schemas.openxmlformats.org/drawingml/2006/main">
+              <a:graphicData uri="http://schemas.openxmlformats.org/drawingml/2006/picture">
+                <pic:pic xmlns:pic="http://schemas.openxmlformats.org/drawingml/2006/picture">
+                  <pic:nvPicPr>
+                    <pic:cNvPr id="10" name="quickdraw_loss_curves.png"/>
+                    <pic:cNvPicPr/>
+                  </pic:nvPicPr>
+                  <pic:blipFill>
+                    <a:blip r:embed="rIdImg10"/>
+                    <a:stretch>
+                      <a:fillRect/>
+                    </a:stretch>
+                  </pic:blipFill>
+                  <pic:spPr>
+                    <a:xfrm>
+                      <a:off x="0" y="0"/>
+                      <a:ext cx="3438906" cy="1934693"/>
+                    </a:xfrm>
+                    <a:prstGeom prst="rect">
+                      <a:avLst/>
+                    </a:prstGeom>
+                  </pic:spPr>
+                </pic:pic>
+              </a:graphicData>
+            </a:graphic>
+          </wp:inline>
+        </w:drawing>
+      </w:r>
+    </w:p>
+    <w:p>
+      <w:r>
+        <w:rPr>
+          <w:b/>
+          <w:i/>
+        </w:rPr>
+        <w:t xml:space="preserve">Figure 10.</w:t>
+      </w:r>
+      <w:r>
+        <w:rPr>
+          <w:i/>
+        </w:rPr>
+        <w:t xml:space="preserve"> QuickDraw DCGAN training loss curves.</w:t>
+      </w:r>
+      <w:r>
+        <w:t xml:space="preserve"> The discriminator loss stays low (≈0.34-0.9) while the generator loss swings through the 1.3-6.1 range as the two networks trade advantage; the absence of a runaway spike or a flat-lined trace confirms stable adversarial training with no collapse across the 50 epochs.</w:t>
       </w:r>
     </w:p>
     <w:p>
       <w:pPr>
         <w:jc w:val="center"/>
-        <w:pBdr>
-          <w:top w:val="single" w:sz="6" w:space="4" w:color="AAAAAA"/>
-          <w:bottom w:val="single" w:sz="6" w:space="4" w:color="AAAAAA"/>
-          <w:left w:val="single" w:sz="6" w:space="4" w:color="AAAAAA"/>
-          <w:right w:val="single" w:sz="6" w:space="4" w:color="AAAAAA"/>
-        </w:pBdr>
       </w:pPr>
       <w:r>
-        <w:rPr>
-          <w:i/>
-          <w:color w:val="777777"/>
-        </w:rPr>
-        <w:t xml:space="preserve">[ insert figure image: quickdraw_progression.png ]</w:t>
-      </w:r>
-    </w:p>
-    <w:p>
-      <w:r>
-        <w:rPr>
-          <w:b/>
-          <w:i/>
-        </w:rPr>
-        <w:t xml:space="preserve">Figure 9.</w:t>
-      </w:r>
-      <w:r>
-        <w:rPr>
-          <w:i/>
-        </w:rPr>
-        <w:t xml:space="preserve"> Generated cake samples across epochs (1, 13, 26, 38, 50).</w:t>
-      </w:r>
-      <w:r>
-        <w:t xml:space="preserve"> The progression shows the outline and candles appearing early in training and then sharpening, evidence that the generator is learning the cake structure rather than memorising it.</w:t>
+        <w:drawing>
+          <wp:inline distT="0" distB="0" distL="0" distR="0">
+            <wp:extent cx="3438906" cy="1889588"/>
+            <wp:docPr id="11" name="quickdraw_real_vs_fake.png"/>
+            <wp:cNvGraphicFramePr>
+              <a:graphicFrameLocks xmlns:a="http://schemas.openxmlformats.org/drawingml/2006/main" noChangeAspect="1"/>
+            </wp:cNvGraphicFramePr>
+            <a:graphic xmlns:a="http://schemas.openxmlformats.org/drawingml/2006/main">
+              <a:graphicData uri="http://schemas.openxmlformats.org/drawingml/2006/picture">
+                <pic:pic xmlns:pic="http://schemas.openxmlformats.org/drawingml/2006/picture">
+                  <pic:nvPicPr>
+                    <pic:cNvPr id="11" name="quickdraw_real_vs_fake.png"/>
+                    <pic:cNvPicPr/>
+                  </pic:nvPicPr>
+                  <pic:blipFill>
+                    <a:blip r:embed="rIdImg11"/>
+                    <a:stretch>
+                      <a:fillRect/>
+                    </a:stretch>
+                  </pic:blipFill>
+                  <pic:spPr>
+                    <a:xfrm>
+                      <a:off x="0" y="0"/>
+                      <a:ext cx="3438906" cy="1889588"/>
+                    </a:xfrm>
+                    <a:prstGeom prst="rect">
+                      <a:avLst/>
+                    </a:prstGeom>
+                  </pic:spPr>
+                </pic:pic>
+              </a:graphicData>
+            </a:graphic>
+          </wp:inline>
+        </w:drawing>
+      </w:r>
+    </w:p>
+    <w:p>
+      <w:r>
+        <w:rPr>
+          <w:b/>
+          <w:i/>
+        </w:rPr>
+        <w:t xml:space="preserve">Figure 11.</w:t>
+      </w:r>
+      <w:r>
+        <w:rPr>
+          <w:i/>
+        </w:rPr>
+        <w:t xml:space="preserve"> Real (left) vs generated (right) birthday-cake sketches.</w:t>
+      </w:r>
+      <w:r>
+        <w:t xml:space="preserve"> The final cakes are easy to read and vary across the grid (no mode collapse); flaws are the usual line-art ones, broken or doubled strokes and slight speckle. The FID is </w:t>
+      </w:r>
+      <w:r>
+        <w:rPr>
+          <w:b/>
+        </w:rPr>
+        <w:t xml:space="preserve">42.67</w:t>
+      </w:r>
+      <w:r>
+        <w:t xml:space="preserve">, notably better than the OCT scans' 79.02, fitting the intuition that clean line art on a plain background sits more comfortably in InceptionV3's feature space than soft medical texture.</w:t>
       </w:r>
     </w:p>
     <w:p>
       <w:pPr>
         <w:jc w:val="center"/>
-        <w:pBdr>
-          <w:top w:val="single" w:sz="6" w:space="4" w:color="AAAAAA"/>
-          <w:bottom w:val="single" w:sz="6" w:space="4" w:color="AAAAAA"/>
-          <w:left w:val="single" w:sz="6" w:space="4" w:color="AAAAAA"/>
-          <w:right w:val="single" w:sz="6" w:space="4" w:color="AAAAAA"/>
-        </w:pBdr>
       </w:pPr>
       <w:r>
-        <w:rPr>
-          <w:i/>
-          <w:color w:val="777777"/>
-        </w:rPr>
-        <w:t xml:space="preserve">[ insert figure image: quickdraw_extension_complexity.png ]</w:t>
-      </w:r>
-    </w:p>
-    <w:p>
-      <w:r>
-        <w:rPr>
-          <w:b/>
-          <w:i/>
-        </w:rPr>
-        <w:t xml:space="preserve">Figure 10.</w:t>
+        <w:drawing>
+          <wp:inline distT="0" distB="0" distL="0" distR="0">
+            <wp:extent cx="3438906" cy="800083"/>
+            <wp:docPr id="12" name="quickdraw_progression.png"/>
+            <wp:cNvGraphicFramePr>
+              <a:graphicFrameLocks xmlns:a="http://schemas.openxmlformats.org/drawingml/2006/main" noChangeAspect="1"/>
+            </wp:cNvGraphicFramePr>
+            <a:graphic xmlns:a="http://schemas.openxmlformats.org/drawingml/2006/main">
+              <a:graphicData uri="http://schemas.openxmlformats.org/drawingml/2006/picture">
+                <pic:pic xmlns:pic="http://schemas.openxmlformats.org/drawingml/2006/picture">
+                  <pic:nvPicPr>
+                    <pic:cNvPr id="12" name="quickdraw_progression.png"/>
+                    <pic:cNvPicPr/>
+                  </pic:nvPicPr>
+                  <pic:blipFill>
+                    <a:blip r:embed="rIdImg12"/>
+                    <a:stretch>
+                      <a:fillRect/>
+                    </a:stretch>
+                  </pic:blipFill>
+                  <pic:spPr>
+                    <a:xfrm>
+                      <a:off x="0" y="0"/>
+                      <a:ext cx="3438906" cy="800083"/>
+                    </a:xfrm>
+                    <a:prstGeom prst="rect">
+                      <a:avLst/>
+                    </a:prstGeom>
+                  </pic:spPr>
+                </pic:pic>
+              </a:graphicData>
+            </a:graphic>
+          </wp:inline>
+        </w:drawing>
+      </w:r>
+    </w:p>
+    <w:p>
+      <w:r>
+        <w:rPr>
+          <w:b/>
+          <w:i/>
+        </w:rPr>
+        <w:t xml:space="preserve">Figure 12.</w:t>
+      </w:r>
+      <w:r>
+        <w:rPr>
+          <w:i/>
+        </w:rPr>
+        <w:t xml:space="preserve"> Generated cake samples across epochs (1, 13, 26, 38, 50).</w:t>
+      </w:r>
+      <w:r>
+        <w:t xml:space="preserve"> The progression shows the outline and candles appearing early in training and then sharpening, evidence that the generator is learning the cake structure rather than memorising it.</w:t>
+      </w:r>
+    </w:p>
+    <w:p>
+      <w:pPr>
+        <w:jc w:val="center"/>
+      </w:pPr>
+      <w:r>
+        <w:drawing>
+          <wp:inline distT="0" distB="0" distL="0" distR="0">
+            <wp:extent cx="4871783" cy="2109277"/>
+            <wp:docPr id="13" name="quickdraw_extension_complexity.png"/>
+            <wp:cNvGraphicFramePr>
+              <a:graphicFrameLocks xmlns:a="http://schemas.openxmlformats.org/drawingml/2006/main" noChangeAspect="1"/>
+            </wp:cNvGraphicFramePr>
+            <a:graphic xmlns:a="http://schemas.openxmlformats.org/drawingml/2006/main">
+              <a:graphicData uri="http://schemas.openxmlformats.org/drawingml/2006/picture">
+                <pic:pic xmlns:pic="http://schemas.openxmlformats.org/drawingml/2006/picture">
+                  <pic:nvPicPr>
+                    <pic:cNvPr id="13" name="quickdraw_extension_complexity.png"/>
+                    <pic:cNvPicPr/>
+                  </pic:nvPicPr>
+                  <pic:blipFill>
+                    <a:blip r:embed="rIdImg13"/>
+                    <a:stretch>
+                      <a:fillRect/>
+                    </a:stretch>
+                  </pic:blipFill>
+                  <pic:spPr>
+                    <a:xfrm>
+                      <a:off x="0" y="0"/>
+                      <a:ext cx="4871783" cy="2109277"/>
+                    </a:xfrm>
+                    <a:prstGeom prst="rect">
+                      <a:avLst/>
+                    </a:prstGeom>
+                  </pic:spPr>
+                </pic:pic>
+              </a:graphicData>
+            </a:graphic>
+          </wp:inline>
+        </w:drawing>
+      </w:r>
+    </w:p>
+    <w:p>
+      <w:r>
+        <w:rPr>
+          <w:b/>
+          <w:i/>
+        </w:rPr>
+        <w:t xml:space="preserve">Figure 13.</w:t>
       </w:r>
       <w:r>
         <w:rPr>

</xml_diff>